<commit_message>
edit the root node
</commit_message>
<xml_diff>
--- a/Documents/ParserDoc.docx
+++ b/Documents/ParserDoc.docx
@@ -1121,18 +1121,30 @@
         <w:rPr>
           <w:rFonts w:asciiTheme="minorBidi" w:hAnsiTheme="minorBidi"/>
         </w:rPr>
-        <w:t xml:space="preserve">Function_Statements </w:t>
-      </w:r>
-      <w:r>
-        <w:rPr>
-          <w:rFonts w:asciiTheme="minorBidi" w:hAnsiTheme="minorBidi"/>
-        </w:rPr>
         <w:t xml:space="preserve">Function_Statement </w:t>
       </w:r>
       <w:r>
         <w:rPr>
           <w:rFonts w:asciiTheme="minorBidi" w:hAnsiTheme="minorBidi"/>
         </w:rPr>
+        <w:t>Function_Statement</w:t>
+      </w:r>
+      <w:r>
+        <w:rPr>
+          <w:rFonts w:asciiTheme="minorBidi" w:hAnsiTheme="minorBidi"/>
+        </w:rPr>
+        <w:t>s</w:t>
+      </w:r>
+      <w:r>
+        <w:rPr>
+          <w:rFonts w:asciiTheme="minorBidi" w:hAnsiTheme="minorBidi"/>
+        </w:rPr>
+        <w:t xml:space="preserve"> </w:t>
+      </w:r>
+      <w:r>
+        <w:rPr>
+          <w:rFonts w:asciiTheme="minorBidi" w:hAnsiTheme="minorBidi"/>
+        </w:rPr>
         <w:t>| ε</w:t>
       </w:r>
     </w:p>
@@ -2005,7 +2017,41 @@
           <w:color w:val="FF0000"/>
         </w:rPr>
       </w:pPr>
-      <w:proofErr w:type="spellStart"/>
+      <w:r>
+        <w:rPr>
+          <w:rFonts w:asciiTheme="minorBidi" w:hAnsiTheme="minorBidi"/>
+          <w:color w:val="FF0000"/>
+        </w:rPr>
+        <w:t xml:space="preserve">Args </w:t>
+      </w:r>
+      <w:r>
+        <w:rPr>
+          <w:rFonts w:asciiTheme="minorBidi" w:hAnsiTheme="minorBidi"/>
+          <w:color w:val="FF0000"/>
+        </w:rPr>
+        <w:sym w:font="Wingdings" w:char="F0E0"/>
+      </w:r>
+      <w:r>
+        <w:rPr>
+          <w:rFonts w:asciiTheme="minorBidi" w:hAnsiTheme="minorBidi"/>
+          <w:color w:val="FF0000"/>
+        </w:rPr>
+        <w:t xml:space="preserve"> </w:t>
+      </w:r>
+      <w:r>
+        <w:rPr>
+          <w:rFonts w:asciiTheme="minorBidi" w:hAnsiTheme="minorBidi"/>
+          <w:color w:val="FF0000"/>
+        </w:rPr>
+        <w:t>Term</w:t>
+      </w:r>
+      <w:r>
+        <w:rPr>
+          <w:rFonts w:asciiTheme="minorBidi" w:hAnsiTheme="minorBidi"/>
+          <w:color w:val="FF0000"/>
+        </w:rPr>
+        <w:t xml:space="preserve"> </w:t>
+      </w:r>
       <w:r>
         <w:rPr>
           <w:rFonts w:asciiTheme="minorBidi" w:hAnsiTheme="minorBidi"/>
@@ -2013,7 +2059,55 @@
         </w:rPr>
         <w:t>Args</w:t>
       </w:r>
-      <w:proofErr w:type="spellEnd"/>
+      <w:r>
+        <w:rPr>
+          <w:rFonts w:asciiTheme="minorBidi" w:hAnsiTheme="minorBidi"/>
+          <w:color w:val="FF0000"/>
+        </w:rPr>
+        <w:t>`</w:t>
+      </w:r>
+      <w:r>
+        <w:rPr>
+          <w:rFonts w:asciiTheme="minorBidi" w:hAnsiTheme="minorBidi"/>
+          <w:color w:val="FF0000"/>
+        </w:rPr>
+        <w:t xml:space="preserve"> | </w:t>
+      </w:r>
+      <w:r>
+        <w:rPr>
+          <w:rFonts w:asciiTheme="minorBidi" w:hAnsiTheme="minorBidi"/>
+          <w:color w:val="FF0000"/>
+        </w:rPr>
+        <w:t>ε</w:t>
+      </w:r>
+    </w:p>
+    <w:p>
+      <w:pPr>
+        <w:pStyle w:val="ListParagraph"/>
+        <w:numPr>
+          <w:ilvl w:val="1"/>
+          <w:numId w:val="4"/>
+        </w:numPr>
+        <w:jc w:val="both"/>
+        <w:rPr>
+          <w:rFonts w:asciiTheme="minorBidi" w:hAnsiTheme="minorBidi"/>
+          <w:color w:val="FF0000"/>
+        </w:rPr>
+      </w:pPr>
+      <w:r>
+        <w:rPr>
+          <w:rFonts w:asciiTheme="minorBidi" w:hAnsiTheme="minorBidi"/>
+          <w:color w:val="FF0000"/>
+        </w:rPr>
+        <w:t>Args</w:t>
+      </w:r>
+      <w:r>
+        <w:rPr>
+          <w:rFonts w:asciiTheme="minorBidi" w:hAnsiTheme="minorBidi"/>
+          <w:color w:val="FF0000"/>
+        </w:rPr>
+        <w:t>`</w:t>
+      </w:r>
       <w:r>
         <w:rPr>
           <w:rFonts w:asciiTheme="minorBidi" w:hAnsiTheme="minorBidi"/>
@@ -2033,6 +2127,20 @@
           <w:rFonts w:asciiTheme="minorBidi" w:hAnsiTheme="minorBidi"/>
           <w:color w:val="FF0000"/>
         </w:rPr>
+        <w:t xml:space="preserve"> , </w:t>
+      </w:r>
+      <w:r>
+        <w:rPr>
+          <w:rFonts w:asciiTheme="minorBidi" w:hAnsiTheme="minorBidi"/>
+          <w:color w:val="FF0000"/>
+        </w:rPr>
+        <w:t>Term</w:t>
+      </w:r>
+      <w:r>
+        <w:rPr>
+          <w:rFonts w:asciiTheme="minorBidi" w:hAnsiTheme="minorBidi"/>
+          <w:color w:val="FF0000"/>
+        </w:rPr>
         <w:t xml:space="preserve"> </w:t>
       </w:r>
       <w:r>
@@ -2040,7 +2148,123 @@
           <w:rFonts w:asciiTheme="minorBidi" w:hAnsiTheme="minorBidi"/>
           <w:color w:val="FF0000"/>
         </w:rPr>
-        <w:t>Term</w:t>
+        <w:t>Args</w:t>
+      </w:r>
+      <w:r>
+        <w:rPr>
+          <w:rFonts w:asciiTheme="minorBidi" w:hAnsiTheme="minorBidi"/>
+          <w:color w:val="FF0000"/>
+        </w:rPr>
+        <w:t>`</w:t>
+      </w:r>
+      <w:r>
+        <w:rPr>
+          <w:rFonts w:asciiTheme="minorBidi" w:hAnsiTheme="minorBidi"/>
+          <w:color w:val="FF0000"/>
+        </w:rPr>
+        <w:t xml:space="preserve"> | ε</w:t>
+      </w:r>
+    </w:p>
+    <w:p>
+      <w:pPr>
+        <w:pStyle w:val="ListParagraph"/>
+        <w:numPr>
+          <w:ilvl w:val="0"/>
+          <w:numId w:val="4"/>
+        </w:numPr>
+        <w:jc w:val="both"/>
+        <w:rPr>
+          <w:rFonts w:asciiTheme="minorBidi" w:hAnsiTheme="minorBidi"/>
+          <w:color w:val="FF0000"/>
+        </w:rPr>
+      </w:pPr>
+      <w:r>
+        <w:rPr>
+          <w:rFonts w:asciiTheme="minorBidi" w:hAnsiTheme="minorBidi"/>
+        </w:rPr>
+        <w:t xml:space="preserve">Equation </w:t>
+      </w:r>
+      <w:r>
+        <w:rPr>
+          <w:rFonts w:asciiTheme="minorBidi" w:hAnsiTheme="minorBidi"/>
+        </w:rPr>
+        <w:sym w:font="Wingdings" w:char="F0E0"/>
+      </w:r>
+      <w:r>
+        <w:rPr>
+          <w:rFonts w:asciiTheme="minorBidi" w:hAnsiTheme="minorBidi"/>
+        </w:rPr>
+        <w:t xml:space="preserve">  Equation Op | Op | Bracket</w:t>
+      </w:r>
+    </w:p>
+    <w:p>
+      <w:pPr>
+        <w:pStyle w:val="ListParagraph"/>
+        <w:numPr>
+          <w:ilvl w:val="1"/>
+          <w:numId w:val="4"/>
+        </w:numPr>
+        <w:jc w:val="both"/>
+        <w:rPr>
+          <w:rFonts w:asciiTheme="minorBidi" w:hAnsiTheme="minorBidi"/>
+          <w:color w:val="EE0000"/>
+        </w:rPr>
+      </w:pPr>
+      <w:r>
+        <w:rPr>
+          <w:rFonts w:asciiTheme="minorBidi" w:hAnsiTheme="minorBidi"/>
+          <w:color w:val="EE0000"/>
+        </w:rPr>
+        <w:t xml:space="preserve">Equation </w:t>
+      </w:r>
+      <w:r>
+        <w:rPr>
+          <w:rFonts w:asciiTheme="minorBidi" w:hAnsiTheme="minorBidi"/>
+          <w:color w:val="EE0000"/>
+        </w:rPr>
+        <w:sym w:font="Wingdings" w:char="F0E0"/>
+      </w:r>
+      <w:r>
+        <w:rPr>
+          <w:rFonts w:asciiTheme="minorBidi" w:hAnsiTheme="minorBidi"/>
+          <w:color w:val="EE0000"/>
+        </w:rPr>
+        <w:t xml:space="preserve"> Op Equation` | Bracket Equation`</w:t>
+      </w:r>
+    </w:p>
+    <w:p>
+      <w:pPr>
+        <w:pStyle w:val="ListParagraph"/>
+        <w:numPr>
+          <w:ilvl w:val="1"/>
+          <w:numId w:val="4"/>
+        </w:numPr>
+        <w:jc w:val="both"/>
+        <w:rPr>
+          <w:rFonts w:asciiTheme="minorBidi" w:hAnsiTheme="minorBidi"/>
+          <w:color w:val="FF0000"/>
+        </w:rPr>
+      </w:pPr>
+      <w:r>
+        <w:rPr>
+          <w:rFonts w:asciiTheme="minorBidi" w:hAnsiTheme="minorBidi"/>
+          <w:color w:val="FF0000"/>
+        </w:rPr>
+        <w:t>Equation`</w:t>
+      </w:r>
+      <w:r>
+        <w:rPr>
+          <w:rFonts w:asciiTheme="minorBidi" w:hAnsiTheme="minorBidi"/>
+          <w:color w:val="FF0000"/>
+        </w:rPr>
+        <w:sym w:font="Wingdings" w:char="F0E0"/>
+      </w:r>
+      <w:r>
+        <w:rPr>
+          <w:rFonts w:asciiTheme="minorBidi" w:hAnsiTheme="minorBidi"/>
+          <w:color w:val="FF0000"/>
+        </w:rPr>
+        <w:t xml:space="preserve"> Op Equation`</w:t>
       </w:r>
       <w:r>
         <w:rPr>
@@ -2049,15 +2273,352 @@
         </w:rPr>
         <w:t xml:space="preserve"> </w:t>
       </w:r>
-      <w:proofErr w:type="spellStart"/>
-      <w:r>
-        <w:rPr>
-          <w:rFonts w:asciiTheme="minorBidi" w:hAnsiTheme="minorBidi"/>
-          <w:color w:val="FF0000"/>
-        </w:rPr>
-        <w:t>Args</w:t>
-      </w:r>
-      <w:proofErr w:type="spellEnd"/>
+      <w:r>
+        <w:rPr>
+          <w:rFonts w:asciiTheme="minorBidi" w:hAnsiTheme="minorBidi"/>
+          <w:color w:val="FF0000"/>
+        </w:rPr>
+        <w:t>| ε</w:t>
+      </w:r>
+    </w:p>
+    <w:p>
+      <w:pPr>
+        <w:pStyle w:val="ListParagraph"/>
+        <w:numPr>
+          <w:ilvl w:val="0"/>
+          <w:numId w:val="4"/>
+        </w:numPr>
+        <w:jc w:val="both"/>
+        <w:rPr>
+          <w:rFonts w:asciiTheme="minorBidi" w:hAnsiTheme="minorBidi"/>
+          <w:color w:val="FF0000"/>
+        </w:rPr>
+      </w:pPr>
+      <w:r>
+        <w:rPr>
+          <w:rFonts w:asciiTheme="minorBidi" w:hAnsiTheme="minorBidi"/>
+        </w:rPr>
+        <w:t xml:space="preserve">Op </w:t>
+      </w:r>
+      <w:r>
+        <w:rPr>
+          <w:rFonts w:asciiTheme="minorBidi" w:hAnsiTheme="minorBidi"/>
+        </w:rPr>
+        <w:sym w:font="Wingdings" w:char="F0E0"/>
+      </w:r>
+      <w:r>
+        <w:rPr>
+          <w:rFonts w:asciiTheme="minorBidi" w:hAnsiTheme="minorBidi"/>
+        </w:rPr>
+        <w:t xml:space="preserve"> </w:t>
+      </w:r>
+      <w:r>
+        <w:rPr>
+          <w:rFonts w:asciiTheme="minorBidi" w:hAnsiTheme="minorBidi"/>
+        </w:rPr>
+        <w:t xml:space="preserve">Term arithmetic_operator </w:t>
+      </w:r>
+      <w:r>
+        <w:rPr>
+          <w:rFonts w:asciiTheme="minorBidi" w:hAnsiTheme="minorBidi"/>
+        </w:rPr>
+        <w:t>Fac | arithmetic_operator Fac</w:t>
+      </w:r>
+    </w:p>
+    <w:p>
+      <w:pPr>
+        <w:pStyle w:val="ListParagraph"/>
+        <w:numPr>
+          <w:ilvl w:val="0"/>
+          <w:numId w:val="4"/>
+        </w:numPr>
+        <w:jc w:val="both"/>
+        <w:rPr>
+          <w:rFonts w:asciiTheme="minorBidi" w:hAnsiTheme="minorBidi"/>
+          <w:color w:val="FF0000"/>
+        </w:rPr>
+      </w:pPr>
+      <w:r>
+        <w:rPr>
+          <w:rFonts w:asciiTheme="minorBidi" w:hAnsiTheme="minorBidi"/>
+        </w:rPr>
+        <w:t>Fac</w:t>
+      </w:r>
+      <w:r>
+        <w:rPr>
+          <w:rFonts w:asciiTheme="minorBidi" w:hAnsiTheme="minorBidi"/>
+        </w:rPr>
+        <w:t xml:space="preserve"> </w:t>
+      </w:r>
+      <w:r>
+        <w:rPr>
+          <w:rFonts w:asciiTheme="minorBidi" w:hAnsiTheme="minorBidi"/>
+        </w:rPr>
+        <w:sym w:font="Wingdings" w:char="F0E0"/>
+      </w:r>
+      <w:r>
+        <w:rPr>
+          <w:rFonts w:asciiTheme="minorBidi" w:hAnsiTheme="minorBidi"/>
+        </w:rPr>
+        <w:t xml:space="preserve"> Term | Bracket</w:t>
+      </w:r>
+    </w:p>
+    <w:p>
+      <w:pPr>
+        <w:pStyle w:val="ListParagraph"/>
+        <w:numPr>
+          <w:ilvl w:val="0"/>
+          <w:numId w:val="4"/>
+        </w:numPr>
+        <w:jc w:val="both"/>
+        <w:rPr>
+          <w:rFonts w:asciiTheme="minorBidi" w:hAnsiTheme="minorBidi"/>
+          <w:color w:val="FF0000"/>
+        </w:rPr>
+      </w:pPr>
+      <w:r>
+        <w:rPr>
+          <w:rFonts w:asciiTheme="minorBidi" w:hAnsiTheme="minorBidi"/>
+          <w:color w:val="000000" w:themeColor="text1"/>
+        </w:rPr>
+        <w:t xml:space="preserve">Bracket </w:t>
+      </w:r>
+      <w:r>
+        <w:rPr>
+          <w:rFonts w:asciiTheme="minorBidi" w:hAnsiTheme="minorBidi"/>
+          <w:color w:val="000000" w:themeColor="text1"/>
+        </w:rPr>
+        <w:sym w:font="Wingdings" w:char="F0E0"/>
+      </w:r>
+      <w:r>
+        <w:rPr>
+          <w:rFonts w:asciiTheme="minorBidi" w:hAnsiTheme="minorBidi"/>
+          <w:color w:val="000000" w:themeColor="text1"/>
+        </w:rPr>
+        <w:t xml:space="preserve"> ( Equation )</w:t>
+      </w:r>
+    </w:p>
+    <w:p>
+      <w:pPr>
+        <w:pStyle w:val="ListParagraph"/>
+        <w:numPr>
+          <w:ilvl w:val="0"/>
+          <w:numId w:val="4"/>
+        </w:numPr>
+        <w:jc w:val="both"/>
+        <w:rPr>
+          <w:rFonts w:asciiTheme="minorBidi" w:hAnsiTheme="minorBidi"/>
+          <w:color w:val="FF0000"/>
+        </w:rPr>
+      </w:pPr>
+      <w:r>
+        <w:rPr>
+          <w:rFonts w:asciiTheme="minorBidi" w:hAnsiTheme="minorBidi"/>
+          <w:color w:val="000000" w:themeColor="text1"/>
+        </w:rPr>
+        <w:t xml:space="preserve">Read_Statement </w:t>
+      </w:r>
+      <w:r>
+        <w:rPr>
+          <w:rFonts w:asciiTheme="minorBidi" w:hAnsiTheme="minorBidi"/>
+          <w:color w:val="000000" w:themeColor="text1"/>
+        </w:rPr>
+        <w:sym w:font="Wingdings" w:char="F0E0"/>
+      </w:r>
+      <w:r>
+        <w:rPr>
+          <w:rFonts w:asciiTheme="minorBidi" w:hAnsiTheme="minorBidi"/>
+          <w:color w:val="000000" w:themeColor="text1"/>
+        </w:rPr>
+        <w:t xml:space="preserve"> read identifier ;</w:t>
+      </w:r>
+    </w:p>
+    <w:p>
+      <w:pPr>
+        <w:pStyle w:val="ListParagraph"/>
+        <w:numPr>
+          <w:ilvl w:val="0"/>
+          <w:numId w:val="4"/>
+        </w:numPr>
+        <w:jc w:val="both"/>
+        <w:rPr>
+          <w:rFonts w:asciiTheme="minorBidi" w:hAnsiTheme="minorBidi"/>
+          <w:color w:val="FF0000"/>
+        </w:rPr>
+      </w:pPr>
+      <w:r>
+        <w:rPr>
+          <w:rFonts w:asciiTheme="minorBidi" w:hAnsiTheme="minorBidi"/>
+        </w:rPr>
+        <w:t xml:space="preserve">Assignment_Statement </w:t>
+      </w:r>
+      <w:r>
+        <w:rPr>
+          <w:rFonts w:asciiTheme="minorBidi" w:hAnsiTheme="minorBidi"/>
+        </w:rPr>
+        <w:sym w:font="Wingdings" w:char="F0E0"/>
+      </w:r>
+      <w:r>
+        <w:rPr>
+          <w:rFonts w:asciiTheme="minorBidi" w:hAnsiTheme="minorBidi"/>
+        </w:rPr>
+        <w:t xml:space="preserve"> identifier := Expression</w:t>
+      </w:r>
+      <w:r>
+        <w:rPr>
+          <w:rFonts w:asciiTheme="minorBidi" w:hAnsiTheme="minorBidi"/>
+        </w:rPr>
+        <w:t xml:space="preserve"> ;</w:t>
+      </w:r>
+    </w:p>
+    <w:p>
+      <w:pPr>
+        <w:pStyle w:val="ListParagraph"/>
+        <w:numPr>
+          <w:ilvl w:val="0"/>
+          <w:numId w:val="4"/>
+        </w:numPr>
+        <w:jc w:val="both"/>
+        <w:rPr>
+          <w:rFonts w:asciiTheme="minorBidi" w:hAnsiTheme="minorBidi"/>
+          <w:color w:val="000000" w:themeColor="text1"/>
+        </w:rPr>
+      </w:pPr>
+      <w:r>
+        <w:rPr>
+          <w:rFonts w:asciiTheme="minorBidi" w:hAnsiTheme="minorBidi"/>
+          <w:color w:val="000000" w:themeColor="text1"/>
+        </w:rPr>
+        <w:t xml:space="preserve">Declaration_Statement </w:t>
+      </w:r>
+      <w:r>
+        <w:rPr>
+          <w:rFonts w:asciiTheme="minorBidi" w:hAnsiTheme="minorBidi"/>
+          <w:color w:val="000000" w:themeColor="text1"/>
+        </w:rPr>
+        <w:sym w:font="Wingdings" w:char="F0E0"/>
+      </w:r>
+      <w:r>
+        <w:rPr>
+          <w:rFonts w:asciiTheme="minorBidi" w:hAnsiTheme="minorBidi"/>
+          <w:color w:val="000000" w:themeColor="text1"/>
+        </w:rPr>
+        <w:t xml:space="preserve"> Data</w:t>
+      </w:r>
+      <w:r>
+        <w:rPr>
+          <w:rFonts w:asciiTheme="minorBidi" w:hAnsiTheme="minorBidi"/>
+          <w:color w:val="000000" w:themeColor="text1"/>
+        </w:rPr>
+        <w:t>t</w:t>
+      </w:r>
+      <w:r>
+        <w:rPr>
+          <w:rFonts w:asciiTheme="minorBidi" w:hAnsiTheme="minorBidi"/>
+          <w:color w:val="000000" w:themeColor="text1"/>
+        </w:rPr>
+        <w:t>ype IdentList ;</w:t>
+      </w:r>
+    </w:p>
+    <w:p>
+      <w:pPr>
+        <w:pStyle w:val="ListParagraph"/>
+        <w:jc w:val="both"/>
+        <w:rPr>
+          <w:rFonts w:asciiTheme="minorBidi" w:hAnsiTheme="minorBidi"/>
+          <w:color w:val="000000" w:themeColor="text1"/>
+        </w:rPr>
+      </w:pPr>
+    </w:p>
+    <w:p>
+      <w:pPr>
+        <w:pStyle w:val="ListParagraph"/>
+        <w:jc w:val="both"/>
+        <w:rPr>
+          <w:rFonts w:asciiTheme="minorBidi" w:hAnsiTheme="minorBidi"/>
+          <w:color w:val="000000" w:themeColor="text1"/>
+        </w:rPr>
+      </w:pPr>
+    </w:p>
+    <w:p>
+      <w:pPr>
+        <w:pStyle w:val="ListParagraph"/>
+        <w:jc w:val="both"/>
+        <w:rPr>
+          <w:rFonts w:asciiTheme="minorBidi" w:hAnsiTheme="minorBidi"/>
+          <w:color w:val="000000" w:themeColor="text1"/>
+        </w:rPr>
+      </w:pPr>
+    </w:p>
+    <w:p>
+      <w:pPr>
+        <w:pStyle w:val="ListParagraph"/>
+        <w:numPr>
+          <w:ilvl w:val="0"/>
+          <w:numId w:val="4"/>
+        </w:numPr>
+        <w:jc w:val="both"/>
+        <w:rPr>
+          <w:rFonts w:asciiTheme="minorBidi" w:hAnsiTheme="minorBidi"/>
+          <w:color w:val="000000" w:themeColor="text1"/>
+        </w:rPr>
+      </w:pPr>
+      <w:r>
+        <w:rPr>
+          <w:rFonts w:asciiTheme="minorBidi" w:hAnsiTheme="minorBidi"/>
+          <w:color w:val="000000" w:themeColor="text1"/>
+        </w:rPr>
+        <w:lastRenderedPageBreak/>
+        <w:t xml:space="preserve">IdentList </w:t>
+      </w:r>
+      <w:r>
+        <w:rPr>
+          <w:rFonts w:asciiTheme="minorBidi" w:hAnsiTheme="minorBidi"/>
+        </w:rPr>
+        <w:sym w:font="Wingdings" w:char="F0E0"/>
+      </w:r>
+      <w:r>
+        <w:rPr>
+          <w:rFonts w:asciiTheme="minorBidi" w:hAnsiTheme="minorBidi"/>
+          <w:color w:val="000000" w:themeColor="text1"/>
+        </w:rPr>
+        <w:t xml:space="preserve"> Ident , IdentList | Ident        </w:t>
+      </w:r>
+    </w:p>
+    <w:p>
+      <w:pPr>
+        <w:pStyle w:val="ListParagraph"/>
+        <w:numPr>
+          <w:ilvl w:val="1"/>
+          <w:numId w:val="4"/>
+        </w:numPr>
+        <w:jc w:val="both"/>
+        <w:rPr>
+          <w:rFonts w:asciiTheme="minorBidi" w:hAnsiTheme="minorBidi"/>
+          <w:color w:val="FF0000"/>
+        </w:rPr>
+      </w:pPr>
+      <w:r>
+        <w:rPr>
+          <w:rFonts w:asciiTheme="minorBidi" w:hAnsiTheme="minorBidi"/>
+          <w:color w:val="FF0000"/>
+        </w:rPr>
+        <w:t xml:space="preserve">IdentList </w:t>
+      </w:r>
+      <w:r>
+        <w:rPr>
+          <w:rFonts w:asciiTheme="minorBidi" w:hAnsiTheme="minorBidi"/>
+          <w:color w:val="FF0000"/>
+        </w:rPr>
+        <w:sym w:font="Wingdings" w:char="F0E0"/>
+      </w:r>
+      <w:r>
+        <w:rPr>
+          <w:rFonts w:asciiTheme="minorBidi" w:hAnsiTheme="minorBidi"/>
+          <w:color w:val="FF0000"/>
+        </w:rPr>
+        <w:t xml:space="preserve"> Ident IdentList</w:t>
+      </w:r>
       <w:r>
         <w:rPr>
           <w:rFonts w:asciiTheme="minorBidi" w:hAnsiTheme="minorBidi"/>
@@ -2065,20 +2626,6 @@
         </w:rPr>
         <w:t>`</w:t>
       </w:r>
-      <w:r>
-        <w:rPr>
-          <w:rFonts w:asciiTheme="minorBidi" w:hAnsiTheme="minorBidi"/>
-          <w:color w:val="FF0000"/>
-        </w:rPr>
-        <w:t xml:space="preserve"> | </w:t>
-      </w:r>
-      <w:r>
-        <w:rPr>
-          <w:rFonts w:asciiTheme="minorBidi" w:hAnsiTheme="minorBidi"/>
-          <w:color w:val="FF0000"/>
-        </w:rPr>
-        <w:t>ε</w:t>
-      </w:r>
     </w:p>
     <w:p>
       <w:pPr>
@@ -2098,534 +2645,6 @@
           <w:rFonts w:asciiTheme="minorBidi" w:hAnsiTheme="minorBidi"/>
           <w:color w:val="FF0000"/>
         </w:rPr>
-        <w:t>Args</w:t>
-      </w:r>
-      <w:r>
-        <w:rPr>
-          <w:rFonts w:asciiTheme="minorBidi" w:hAnsiTheme="minorBidi"/>
-          <w:color w:val="FF0000"/>
-        </w:rPr>
-        <w:t>`</w:t>
-      </w:r>
-      <w:r>
-        <w:rPr>
-          <w:rFonts w:asciiTheme="minorBidi" w:hAnsiTheme="minorBidi"/>
-          <w:color w:val="FF0000"/>
-        </w:rPr>
-        <w:t xml:space="preserve"> </w:t>
-      </w:r>
-      <w:r>
-        <w:rPr>
-          <w:rFonts w:asciiTheme="minorBidi" w:hAnsiTheme="minorBidi"/>
-          <w:color w:val="FF0000"/>
-        </w:rPr>
-        <w:sym w:font="Wingdings" w:char="F0E0"/>
-      </w:r>
-      <w:r>
-        <w:rPr>
-          <w:rFonts w:asciiTheme="minorBidi" w:hAnsiTheme="minorBidi"/>
-          <w:color w:val="FF0000"/>
-        </w:rPr>
-        <w:t xml:space="preserve"> , </w:t>
-      </w:r>
-      <w:r>
-        <w:rPr>
-          <w:rFonts w:asciiTheme="minorBidi" w:hAnsiTheme="minorBidi"/>
-          <w:color w:val="FF0000"/>
-        </w:rPr>
-        <w:t>Term</w:t>
-      </w:r>
-      <w:r>
-        <w:rPr>
-          <w:rFonts w:asciiTheme="minorBidi" w:hAnsiTheme="minorBidi"/>
-          <w:color w:val="FF0000"/>
-        </w:rPr>
-        <w:t xml:space="preserve"> </w:t>
-      </w:r>
-      <w:proofErr w:type="spellStart"/>
-      <w:r>
-        <w:rPr>
-          <w:rFonts w:asciiTheme="minorBidi" w:hAnsiTheme="minorBidi"/>
-          <w:color w:val="FF0000"/>
-        </w:rPr>
-        <w:t>Args</w:t>
-      </w:r>
-      <w:proofErr w:type="spellEnd"/>
-      <w:r>
-        <w:rPr>
-          <w:rFonts w:asciiTheme="minorBidi" w:hAnsiTheme="minorBidi"/>
-          <w:color w:val="FF0000"/>
-        </w:rPr>
-        <w:t>`</w:t>
-      </w:r>
-      <w:r>
-        <w:rPr>
-          <w:rFonts w:asciiTheme="minorBidi" w:hAnsiTheme="minorBidi"/>
-          <w:color w:val="FF0000"/>
-        </w:rPr>
-        <w:t xml:space="preserve"> | ε</w:t>
-      </w:r>
-    </w:p>
-    <w:p>
-      <w:pPr>
-        <w:pStyle w:val="ListParagraph"/>
-        <w:numPr>
-          <w:ilvl w:val="0"/>
-          <w:numId w:val="4"/>
-        </w:numPr>
-        <w:jc w:val="both"/>
-        <w:rPr>
-          <w:rFonts w:asciiTheme="minorBidi" w:hAnsiTheme="minorBidi"/>
-          <w:color w:val="FF0000"/>
-        </w:rPr>
-      </w:pPr>
-      <w:r>
-        <w:rPr>
-          <w:rFonts w:asciiTheme="minorBidi" w:hAnsiTheme="minorBidi"/>
-        </w:rPr>
-        <w:t xml:space="preserve">Equation </w:t>
-      </w:r>
-      <w:r>
-        <w:rPr>
-          <w:rFonts w:asciiTheme="minorBidi" w:hAnsiTheme="minorBidi"/>
-        </w:rPr>
-        <w:sym w:font="Wingdings" w:char="F0E0"/>
-      </w:r>
-      <w:r>
-        <w:rPr>
-          <w:rFonts w:asciiTheme="minorBidi" w:hAnsiTheme="minorBidi"/>
-        </w:rPr>
-        <w:t xml:space="preserve">  Equation Op | Op | Bracket</w:t>
-      </w:r>
-    </w:p>
-    <w:p>
-      <w:pPr>
-        <w:pStyle w:val="ListParagraph"/>
-        <w:numPr>
-          <w:ilvl w:val="1"/>
-          <w:numId w:val="4"/>
-        </w:numPr>
-        <w:jc w:val="both"/>
-        <w:rPr>
-          <w:rFonts w:asciiTheme="minorBidi" w:hAnsiTheme="minorBidi"/>
-          <w:color w:val="EE0000"/>
-        </w:rPr>
-      </w:pPr>
-      <w:r>
-        <w:rPr>
-          <w:rFonts w:asciiTheme="minorBidi" w:hAnsiTheme="minorBidi"/>
-          <w:color w:val="EE0000"/>
-        </w:rPr>
-        <w:t xml:space="preserve">Equation </w:t>
-      </w:r>
-      <w:r>
-        <w:rPr>
-          <w:rFonts w:asciiTheme="minorBidi" w:hAnsiTheme="minorBidi"/>
-          <w:color w:val="EE0000"/>
-        </w:rPr>
-        <w:sym w:font="Wingdings" w:char="F0E0"/>
-      </w:r>
-      <w:r>
-        <w:rPr>
-          <w:rFonts w:asciiTheme="minorBidi" w:hAnsiTheme="minorBidi"/>
-          <w:color w:val="EE0000"/>
-        </w:rPr>
-        <w:t xml:space="preserve"> Op Equation` | Bracket Equation`</w:t>
-      </w:r>
-    </w:p>
-    <w:p>
-      <w:pPr>
-        <w:pStyle w:val="ListParagraph"/>
-        <w:numPr>
-          <w:ilvl w:val="1"/>
-          <w:numId w:val="4"/>
-        </w:numPr>
-        <w:jc w:val="both"/>
-        <w:rPr>
-          <w:rFonts w:asciiTheme="minorBidi" w:hAnsiTheme="minorBidi"/>
-          <w:color w:val="FF0000"/>
-        </w:rPr>
-      </w:pPr>
-      <w:r>
-        <w:rPr>
-          <w:rFonts w:asciiTheme="minorBidi" w:hAnsiTheme="minorBidi"/>
-          <w:color w:val="FF0000"/>
-        </w:rPr>
-        <w:t>Equation`</w:t>
-      </w:r>
-      <w:r>
-        <w:rPr>
-          <w:rFonts w:asciiTheme="minorBidi" w:hAnsiTheme="minorBidi"/>
-          <w:color w:val="FF0000"/>
-        </w:rPr>
-        <w:sym w:font="Wingdings" w:char="F0E0"/>
-      </w:r>
-      <w:r>
-        <w:rPr>
-          <w:rFonts w:asciiTheme="minorBidi" w:hAnsiTheme="minorBidi"/>
-          <w:color w:val="FF0000"/>
-        </w:rPr>
-        <w:t xml:space="preserve"> Op Equation`</w:t>
-      </w:r>
-      <w:r>
-        <w:rPr>
-          <w:rFonts w:asciiTheme="minorBidi" w:hAnsiTheme="minorBidi"/>
-          <w:color w:val="FF0000"/>
-        </w:rPr>
-        <w:t xml:space="preserve"> </w:t>
-      </w:r>
-      <w:r>
-        <w:rPr>
-          <w:rFonts w:asciiTheme="minorBidi" w:hAnsiTheme="minorBidi"/>
-          <w:color w:val="FF0000"/>
-        </w:rPr>
-        <w:t>| ε</w:t>
-      </w:r>
-    </w:p>
-    <w:p>
-      <w:pPr>
-        <w:pStyle w:val="ListParagraph"/>
-        <w:numPr>
-          <w:ilvl w:val="0"/>
-          <w:numId w:val="4"/>
-        </w:numPr>
-        <w:jc w:val="both"/>
-        <w:rPr>
-          <w:rFonts w:asciiTheme="minorBidi" w:hAnsiTheme="minorBidi"/>
-          <w:color w:val="FF0000"/>
-        </w:rPr>
-      </w:pPr>
-      <w:r>
-        <w:rPr>
-          <w:rFonts w:asciiTheme="minorBidi" w:hAnsiTheme="minorBidi"/>
-        </w:rPr>
-        <w:t xml:space="preserve">Op </w:t>
-      </w:r>
-      <w:r>
-        <w:rPr>
-          <w:rFonts w:asciiTheme="minorBidi" w:hAnsiTheme="minorBidi"/>
-        </w:rPr>
-        <w:sym w:font="Wingdings" w:char="F0E0"/>
-      </w:r>
-      <w:r>
-        <w:rPr>
-          <w:rFonts w:asciiTheme="minorBidi" w:hAnsiTheme="minorBidi"/>
-        </w:rPr>
-        <w:t xml:space="preserve"> </w:t>
-      </w:r>
-      <w:r>
-        <w:rPr>
-          <w:rFonts w:asciiTheme="minorBidi" w:hAnsiTheme="minorBidi"/>
-        </w:rPr>
-        <w:t xml:space="preserve">Term arithmetic_operator </w:t>
-      </w:r>
-      <w:r>
-        <w:rPr>
-          <w:rFonts w:asciiTheme="minorBidi" w:hAnsiTheme="minorBidi"/>
-        </w:rPr>
-        <w:t>Fac | arithmetic_operator Fac</w:t>
-      </w:r>
-    </w:p>
-    <w:p>
-      <w:pPr>
-        <w:pStyle w:val="ListParagraph"/>
-        <w:numPr>
-          <w:ilvl w:val="0"/>
-          <w:numId w:val="4"/>
-        </w:numPr>
-        <w:jc w:val="both"/>
-        <w:rPr>
-          <w:rFonts w:asciiTheme="minorBidi" w:hAnsiTheme="minorBidi"/>
-          <w:color w:val="FF0000"/>
-        </w:rPr>
-      </w:pPr>
-      <w:r>
-        <w:rPr>
-          <w:rFonts w:asciiTheme="minorBidi" w:hAnsiTheme="minorBidi"/>
-        </w:rPr>
-        <w:t>Fac</w:t>
-      </w:r>
-      <w:r>
-        <w:rPr>
-          <w:rFonts w:asciiTheme="minorBidi" w:hAnsiTheme="minorBidi"/>
-        </w:rPr>
-        <w:t xml:space="preserve"> </w:t>
-      </w:r>
-      <w:r>
-        <w:rPr>
-          <w:rFonts w:asciiTheme="minorBidi" w:hAnsiTheme="minorBidi"/>
-        </w:rPr>
-        <w:sym w:font="Wingdings" w:char="F0E0"/>
-      </w:r>
-      <w:r>
-        <w:rPr>
-          <w:rFonts w:asciiTheme="minorBidi" w:hAnsiTheme="minorBidi"/>
-        </w:rPr>
-        <w:t xml:space="preserve"> Term | Bracket</w:t>
-      </w:r>
-    </w:p>
-    <w:p>
-      <w:pPr>
-        <w:pStyle w:val="ListParagraph"/>
-        <w:numPr>
-          <w:ilvl w:val="0"/>
-          <w:numId w:val="4"/>
-        </w:numPr>
-        <w:jc w:val="both"/>
-        <w:rPr>
-          <w:rFonts w:asciiTheme="minorBidi" w:hAnsiTheme="minorBidi"/>
-          <w:color w:val="FF0000"/>
-        </w:rPr>
-      </w:pPr>
-      <w:r>
-        <w:rPr>
-          <w:rFonts w:asciiTheme="minorBidi" w:hAnsiTheme="minorBidi"/>
-          <w:color w:val="000000" w:themeColor="text1"/>
-        </w:rPr>
-        <w:t xml:space="preserve">Bracket </w:t>
-      </w:r>
-      <w:r>
-        <w:rPr>
-          <w:rFonts w:asciiTheme="minorBidi" w:hAnsiTheme="minorBidi"/>
-          <w:color w:val="000000" w:themeColor="text1"/>
-        </w:rPr>
-        <w:sym w:font="Wingdings" w:char="F0E0"/>
-      </w:r>
-      <w:r>
-        <w:rPr>
-          <w:rFonts w:asciiTheme="minorBidi" w:hAnsiTheme="minorBidi"/>
-          <w:color w:val="000000" w:themeColor="text1"/>
-        </w:rPr>
-        <w:t xml:space="preserve"> ( Equation )</w:t>
-      </w:r>
-    </w:p>
-    <w:p>
-      <w:pPr>
-        <w:pStyle w:val="ListParagraph"/>
-        <w:numPr>
-          <w:ilvl w:val="0"/>
-          <w:numId w:val="4"/>
-        </w:numPr>
-        <w:jc w:val="both"/>
-        <w:rPr>
-          <w:rFonts w:asciiTheme="minorBidi" w:hAnsiTheme="minorBidi"/>
-          <w:color w:val="FF0000"/>
-        </w:rPr>
-      </w:pPr>
-      <w:r>
-        <w:rPr>
-          <w:rFonts w:asciiTheme="minorBidi" w:hAnsiTheme="minorBidi"/>
-          <w:color w:val="000000" w:themeColor="text1"/>
-        </w:rPr>
-        <w:t xml:space="preserve">Read_Statement </w:t>
-      </w:r>
-      <w:r>
-        <w:rPr>
-          <w:rFonts w:asciiTheme="minorBidi" w:hAnsiTheme="minorBidi"/>
-          <w:color w:val="000000" w:themeColor="text1"/>
-        </w:rPr>
-        <w:sym w:font="Wingdings" w:char="F0E0"/>
-      </w:r>
-      <w:r>
-        <w:rPr>
-          <w:rFonts w:asciiTheme="minorBidi" w:hAnsiTheme="minorBidi"/>
-          <w:color w:val="000000" w:themeColor="text1"/>
-        </w:rPr>
-        <w:t xml:space="preserve"> read identifier ;</w:t>
-      </w:r>
-    </w:p>
-    <w:p>
-      <w:pPr>
-        <w:pStyle w:val="ListParagraph"/>
-        <w:numPr>
-          <w:ilvl w:val="0"/>
-          <w:numId w:val="4"/>
-        </w:numPr>
-        <w:jc w:val="both"/>
-        <w:rPr>
-          <w:rFonts w:asciiTheme="minorBidi" w:hAnsiTheme="minorBidi"/>
-          <w:color w:val="FF0000"/>
-        </w:rPr>
-      </w:pPr>
-      <w:r>
-        <w:rPr>
-          <w:rFonts w:asciiTheme="minorBidi" w:hAnsiTheme="minorBidi"/>
-        </w:rPr>
-        <w:t xml:space="preserve">Assignment_Statement </w:t>
-      </w:r>
-      <w:r>
-        <w:rPr>
-          <w:rFonts w:asciiTheme="minorBidi" w:hAnsiTheme="minorBidi"/>
-        </w:rPr>
-        <w:sym w:font="Wingdings" w:char="F0E0"/>
-      </w:r>
-      <w:r>
-        <w:rPr>
-          <w:rFonts w:asciiTheme="minorBidi" w:hAnsiTheme="minorBidi"/>
-        </w:rPr>
-        <w:t xml:space="preserve"> identifier := Expression</w:t>
-      </w:r>
-      <w:r>
-        <w:rPr>
-          <w:rFonts w:asciiTheme="minorBidi" w:hAnsiTheme="minorBidi"/>
-        </w:rPr>
-        <w:t xml:space="preserve"> ;</w:t>
-      </w:r>
-    </w:p>
-    <w:p>
-      <w:pPr>
-        <w:pStyle w:val="ListParagraph"/>
-        <w:numPr>
-          <w:ilvl w:val="0"/>
-          <w:numId w:val="4"/>
-        </w:numPr>
-        <w:jc w:val="both"/>
-        <w:rPr>
-          <w:rFonts w:asciiTheme="minorBidi" w:hAnsiTheme="minorBidi"/>
-          <w:color w:val="000000" w:themeColor="text1"/>
-        </w:rPr>
-      </w:pPr>
-      <w:r>
-        <w:rPr>
-          <w:rFonts w:asciiTheme="minorBidi" w:hAnsiTheme="minorBidi"/>
-          <w:color w:val="000000" w:themeColor="text1"/>
-        </w:rPr>
-        <w:t xml:space="preserve">Declaration_Statement </w:t>
-      </w:r>
-      <w:r>
-        <w:rPr>
-          <w:rFonts w:asciiTheme="minorBidi" w:hAnsiTheme="minorBidi"/>
-          <w:color w:val="000000" w:themeColor="text1"/>
-        </w:rPr>
-        <w:sym w:font="Wingdings" w:char="F0E0"/>
-      </w:r>
-      <w:r>
-        <w:rPr>
-          <w:rFonts w:asciiTheme="minorBidi" w:hAnsiTheme="minorBidi"/>
-          <w:color w:val="000000" w:themeColor="text1"/>
-        </w:rPr>
-        <w:t xml:space="preserve"> Data</w:t>
-      </w:r>
-      <w:r>
-        <w:rPr>
-          <w:rFonts w:asciiTheme="minorBidi" w:hAnsiTheme="minorBidi"/>
-          <w:color w:val="000000" w:themeColor="text1"/>
-        </w:rPr>
-        <w:t>t</w:t>
-      </w:r>
-      <w:r>
-        <w:rPr>
-          <w:rFonts w:asciiTheme="minorBidi" w:hAnsiTheme="minorBidi"/>
-          <w:color w:val="000000" w:themeColor="text1"/>
-        </w:rPr>
-        <w:t>ype IdentList ;</w:t>
-      </w:r>
-    </w:p>
-    <w:p>
-      <w:pPr>
-        <w:pStyle w:val="ListParagraph"/>
-        <w:jc w:val="both"/>
-        <w:rPr>
-          <w:rFonts w:asciiTheme="minorBidi" w:hAnsiTheme="minorBidi"/>
-          <w:color w:val="000000" w:themeColor="text1"/>
-        </w:rPr>
-      </w:pPr>
-    </w:p>
-    <w:p>
-      <w:pPr>
-        <w:pStyle w:val="ListParagraph"/>
-        <w:numPr>
-          <w:ilvl w:val="0"/>
-          <w:numId w:val="4"/>
-        </w:numPr>
-        <w:jc w:val="both"/>
-        <w:rPr>
-          <w:rFonts w:asciiTheme="minorBidi" w:hAnsiTheme="minorBidi"/>
-          <w:color w:val="000000" w:themeColor="text1"/>
-        </w:rPr>
-      </w:pPr>
-      <w:r>
-        <w:rPr>
-          <w:rFonts w:asciiTheme="minorBidi" w:hAnsiTheme="minorBidi"/>
-          <w:color w:val="000000" w:themeColor="text1"/>
-        </w:rPr>
-        <w:t xml:space="preserve">IdentList </w:t>
-      </w:r>
-      <w:r>
-        <w:rPr>
-          <w:rFonts w:asciiTheme="minorBidi" w:hAnsiTheme="minorBidi"/>
-        </w:rPr>
-        <w:sym w:font="Wingdings" w:char="F0E0"/>
-      </w:r>
-      <w:r>
-        <w:rPr>
-          <w:rFonts w:asciiTheme="minorBidi" w:hAnsiTheme="minorBidi"/>
-          <w:color w:val="000000" w:themeColor="text1"/>
-        </w:rPr>
-        <w:t xml:space="preserve"> Ident , IdentList | Ident        </w:t>
-      </w:r>
-    </w:p>
-    <w:p>
-      <w:pPr>
-        <w:pStyle w:val="ListParagraph"/>
-        <w:numPr>
-          <w:ilvl w:val="1"/>
-          <w:numId w:val="4"/>
-        </w:numPr>
-        <w:jc w:val="both"/>
-        <w:rPr>
-          <w:rFonts w:asciiTheme="minorBidi" w:hAnsiTheme="minorBidi"/>
-          <w:color w:val="FF0000"/>
-        </w:rPr>
-      </w:pPr>
-      <w:r>
-        <w:rPr>
-          <w:rFonts w:asciiTheme="minorBidi" w:hAnsiTheme="minorBidi"/>
-          <w:color w:val="FF0000"/>
-        </w:rPr>
-        <w:t xml:space="preserve">IdentList </w:t>
-      </w:r>
-      <w:r>
-        <w:rPr>
-          <w:rFonts w:asciiTheme="minorBidi" w:hAnsiTheme="minorBidi"/>
-          <w:color w:val="FF0000"/>
-        </w:rPr>
-        <w:sym w:font="Wingdings" w:char="F0E0"/>
-      </w:r>
-      <w:r>
-        <w:rPr>
-          <w:rFonts w:asciiTheme="minorBidi" w:hAnsiTheme="minorBidi"/>
-          <w:color w:val="FF0000"/>
-        </w:rPr>
-        <w:t xml:space="preserve"> Ident IdentList</w:t>
-      </w:r>
-      <w:r>
-        <w:rPr>
-          <w:rFonts w:asciiTheme="minorBidi" w:hAnsiTheme="minorBidi"/>
-          <w:color w:val="FF0000"/>
-        </w:rPr>
-        <w:t>`</w:t>
-      </w:r>
-    </w:p>
-    <w:p>
-      <w:pPr>
-        <w:pStyle w:val="ListParagraph"/>
-        <w:numPr>
-          <w:ilvl w:val="1"/>
-          <w:numId w:val="4"/>
-        </w:numPr>
-        <w:jc w:val="both"/>
-        <w:rPr>
-          <w:rFonts w:asciiTheme="minorBidi" w:hAnsiTheme="minorBidi"/>
-          <w:color w:val="FF0000"/>
-        </w:rPr>
-      </w:pPr>
-      <w:r>
-        <w:rPr>
-          <w:rFonts w:asciiTheme="minorBidi" w:hAnsiTheme="minorBidi"/>
-          <w:color w:val="FF0000"/>
-        </w:rPr>
-        <w:lastRenderedPageBreak/>
         <w:t>IdentList</w:t>
       </w:r>
       <w:r>

</xml_diff>